<commit_message>
docs: guide de synchro — ajout du correctif bouton "Télécharger le CV"
Co-Authored-By: Claude Opus 4.8 <noreply@anthropic.com>
</commit_message>
<xml_diff>
--- a/Guide-Sync-Maison-2026-07-09.docx
+++ b/Guide-Sync-Maison-2026-07-09.docx
@@ -170,6 +170,23 @@
         <w:rPr>
           <w:b/>
         </w:rPr>
+        <w:t xml:space="preserve">Correctif candidat : </w:t>
+      </w:r>
+      <w:r>
+        <w:t xml:space="preserve">le bouton « Télécharger le CV » de la fiche candidat est désormais fonctionnel (export du CV en fichier .txt).</w:t>
+      </w:r>
+    </w:p>
+    <w:p>
+      <w:pPr>
+        <w:pStyle w:val="Bullet"/>
+      </w:pPr>
+      <w:r>
+        <w:t xml:space="preserve">•  </w:t>
+      </w:r>
+      <w:r>
+        <w:rPr>
+          <w:b/>
+        </w:rPr>
         <w:t xml:space="preserve">Docs : </w:t>
       </w:r>
       <w:r>
@@ -428,6 +445,18 @@
           <w:shd w:val="clear" w:fill="EEF2F7"/>
         </w:rPr>
         <w:t xml:space="preserve">src/components/ConnectionsView.tsx  (nouveau)</w:t>
+      </w:r>
+    </w:p>
+    <w:p>
+      <w:pPr>
+        <w:pStyle w:val="Code"/>
+      </w:pPr>
+      <w:r>
+        <w:rPr>
+          <w:rFonts w:ascii="Consolas" w:hAnsi="Consolas"/>
+          <w:shd w:val="clear" w:fill="EEF2F7"/>
+        </w:rPr>
+        <w:t xml:space="preserve">src/components/CandidateProfileView.tsx</w:t>
       </w:r>
     </w:p>
     <w:p>

</xml_diff>

<commit_message>
docs: guide de synchro — npm install requis (jspdf) + CV en PDF
Co-Authored-By: Claude Opus 4.8 <noreply@anthropic.com>
</commit_message>
<xml_diff>
--- a/Guide-Sync-Maison-2026-07-09.docx
+++ b/Guide-Sync-Maison-2026-07-09.docx
@@ -173,7 +173,7 @@
         <w:t xml:space="preserve">Correctif candidat : </w:t>
       </w:r>
       <w:r>
-        <w:t xml:space="preserve">le bouton « Télécharger le CV » de la fiche candidat est désormais fonctionnel (export du CV en fichier .txt).</w:t>
+        <w:t xml:space="preserve">le bouton « Télécharger le CV » de la fiche candidat est désormais fonctionnel — export du CV en PDF (via la bibliothèque jsPDF).</w:t>
       </w:r>
     </w:p>
     <w:p>
@@ -336,6 +336,30 @@
           <w:rFonts w:ascii="Consolas" w:hAnsi="Consolas"/>
           <w:shd w:val="clear" w:fill="EEF2F7"/>
         </w:rPr>
+        <w:t xml:space="preserve">package.json</w:t>
+      </w:r>
+    </w:p>
+    <w:p>
+      <w:pPr>
+        <w:pStyle w:val="Code"/>
+      </w:pPr>
+      <w:r>
+        <w:rPr>
+          <w:rFonts w:ascii="Consolas" w:hAnsi="Consolas"/>
+          <w:shd w:val="clear" w:fill="EEF2F7"/>
+        </w:rPr>
+        <w:t xml:space="preserve">package-lock.json</w:t>
+      </w:r>
+    </w:p>
+    <w:p>
+      <w:pPr>
+        <w:pStyle w:val="Code"/>
+      </w:pPr>
+      <w:r>
+        <w:rPr>
+          <w:rFonts w:ascii="Consolas" w:hAnsi="Consolas"/>
+          <w:shd w:val="clear" w:fill="EEF2F7"/>
+        </w:rPr>
         <w:t xml:space="preserve">server.ts</w:t>
       </w:r>
     </w:p>
@@ -620,6 +644,32 @@
         <w:t xml:space="preserve">1. </w:t>
       </w:r>
       <w:r>
+        <w:t xml:space="preserve">Installer les dépendances (une nouvelle a été ajoutée aujourd'hui : jspdf, pour l'export PDF du CV) :</w:t>
+      </w:r>
+    </w:p>
+    <w:p>
+      <w:pPr>
+        <w:pStyle w:val="Code"/>
+      </w:pPr>
+      <w:r>
+        <w:rPr>
+          <w:rFonts w:ascii="Consolas" w:hAnsi="Consolas"/>
+          <w:shd w:val="clear" w:fill="EEF2F7"/>
+        </w:rPr>
+        <w:t xml:space="preserve">npm install</w:t>
+      </w:r>
+    </w:p>
+    <w:p>
+      <w:pPr>
+        <w:pStyle w:val="Body"/>
+      </w:pPr>
+      <w:r>
+        <w:rPr>
+          <w:b/>
+        </w:rPr>
+        <w:t xml:space="preserve">2. </w:t>
+      </w:r>
+      <w:r>
         <w:t xml:space="preserve">Régénérer le client Prisma (nouveaux champs ip / userAgent du journal) :</w:t>
       </w:r>
     </w:p>
@@ -643,7 +693,7 @@
         <w:rPr>
           <w:b/>
         </w:rPr>
-        <w:t xml:space="preserve">2. </w:t>
+        <w:t xml:space="preserve">3. </w:t>
       </w:r>
       <w:r>
         <w:t xml:space="preserve">Appliquer la nouvelle migration à votre base maison (ajoute les colonnes ip / userAgent) — NÉCESSAIRE aujourd'hui :</w:t>
@@ -669,7 +719,7 @@
         <w:rPr>
           <w:b/>
         </w:rPr>
-        <w:t xml:space="preserve">3. </w:t>
+        <w:t xml:space="preserve">4. </w:t>
       </w:r>
       <w:r>
         <w:t xml:space="preserve">Mettre les données à jour (idempotent : ajoute samuel@test.io, retire Sarah/Marc, aligne les salaires des offres de démo sur 3 000 000 Ariary) :</w:t>
@@ -695,7 +745,7 @@
         <w:rPr>
           <w:b/>
         </w:rPr>
-        <w:t xml:space="preserve">4. </w:t>
+        <w:t xml:space="preserve">5. </w:t>
       </w:r>
       <w:r>
         <w:t xml:space="preserve">(Optionnel) Forcer TOUTES les offres — y compris celles créées chez vous — à 3 000 000 Ariary :</w:t>
@@ -721,7 +771,7 @@
         <w:rPr>
           <w:b/>
         </w:rPr>
-        <w:t xml:space="preserve">5. </w:t>
+        <w:t xml:space="preserve">6. </w:t>
       </w:r>
       <w:r>
         <w:t xml:space="preserve">Vérifier que le projet compile :</w:t>
@@ -747,7 +797,7 @@
         <w:rPr>
           <w:b/>
         </w:rPr>
-        <w:t xml:space="preserve">6. </w:t>
+        <w:t xml:space="preserve">7. </w:t>
       </w:r>
       <w:r>
         <w:t xml:space="preserve">Relancer le serveur de dev, puis Ctrl+F5 dans le navigateur :</w:t>
@@ -792,27 +842,10 @@
         <w:rPr>
           <w:b/>
         </w:rPr>
-        <w:t xml:space="preserve">Pas de npm install : </w:t>
-      </w:r>
-      <w:r>
-        <w:t xml:space="preserve">aucune dépendance ajoutée aujourd'hui (package.json inchangé).</w:t>
-      </w:r>
-    </w:p>
-    <w:p>
-      <w:pPr>
-        <w:pStyle w:val="Bullet"/>
-      </w:pPr>
-      <w:r>
-        <w:t xml:space="preserve">•  </w:t>
-      </w:r>
-      <w:r>
-        <w:rPr>
-          <w:b/>
-        </w:rPr>
         <w:t xml:space="preserve">Prod déjà à jour : </w:t>
       </w:r>
       <w:r>
-        <w:t xml:space="preserve">la migration et les données ont déjà été appliquées à Neon via le déploiement (rien à faire côté production).</w:t>
+        <w:t xml:space="preserve">migration, données et déploiement ont déjà été appliqués à Render/Neon (rien à faire côté production).</w:t>
       </w:r>
     </w:p>
     <w:p>

</xml_diff>